<commit_message>
Stages A-P executed locally by operator session: docs, evidence, semantic layer, transformed repo (imported and re-verified: 176 passed)
Co-Authored-By: Claude Sonnet 5.5 <noreply@anthropic.com>
Claude-Session: https://claude.ai/code/session_0151qWWqXudLjd499hP5H6NW
</commit_message>
<xml_diff>
--- a/runbook/README.docx
+++ b/runbook/README.docx
@@ -2,14 +2,15 @@
 <file path=word/document.xml><?xml version="1.0" encoding="utf-8"?>
 <w:document xmlns:w="http://schemas.openxmlformats.org/wordprocessingml/2006/main" xmlns:m="http://schemas.openxmlformats.org/officeDocument/2006/math" xmlns:r="http://schemas.openxmlformats.org/officeDocument/2006/relationships" xmlns:o="urn:schemas-microsoft-com:office:office" xmlns:v="urn:schemas-microsoft-com:vml" xmlns:w10="urn:schemas-microsoft-com:office:word" xmlns:a="http://schemas.openxmlformats.org/drawingml/2006/main" xmlns:pic="http://schemas.openxmlformats.org/drawingml/2006/picture" xmlns:wp="http://schemas.openxmlformats.org/drawingml/2006/wordprocessingDrawing">
   <w:body>
-    <w:bookmarkStart w:id="24" w:name="Xb69d54ee4626114b7191565ef02b2757bcfda53"/>
     <w:p>
       <w:pPr>
         <w:pStyle w:val="Heading1"/>
       </w:pPr>
+      <w:bookmarkStart w:id="20" w:name="X23a382400fc109eef49ad004bb6f1794d5410fe"/>
       <w:r>
         <w:t xml:space="preserve">Brownfield → Production-Grade Transformation Runbook</w:t>
       </w:r>
+      <w:bookmarkEnd w:id="20"/>
     </w:p>
     <w:p>
       <w:pPr>
@@ -17,7 +18,6 @@
       </w:pPr>
       <w:r>
         <w:rPr>
-          <w:bCs/>
           <w:b/>
         </w:rPr>
         <w:t xml:space="preserve">Target system:</w:t>
@@ -48,7 +48,6 @@
       </w:r>
       <w:r>
         <w:rPr>
-          <w:bCs/>
           <w:b/>
         </w:rPr>
         <w:t xml:space="preserve">Prepared by:</w:t>
@@ -64,7 +63,6 @@
       </w:r>
       <w:r>
         <w:rPr>
-          <w:bCs/>
           <w:b/>
         </w:rPr>
         <w:t xml:space="preserve">Version:</w:t>
@@ -80,7 +78,6 @@
       </w:r>
       <w:r>
         <w:rPr>
-          <w:bCs/>
           <w:b/>
         </w:rPr>
         <w:t xml:space="preserve">Date:</w:t>
@@ -96,7 +93,6 @@
       </w:r>
       <w:r>
         <w:rPr>
-          <w:bCs/>
           <w:b/>
         </w:rPr>
         <w:t xml:space="preserve">Status:</w:t>
@@ -115,14 +111,15 @@
         </w:pict>
       </w:r>
     </w:p>
-    <w:bookmarkStart w:id="20" w:name="what-this-package-is"/>
     <w:p>
       <w:pPr>
         <w:pStyle w:val="Heading2"/>
       </w:pPr>
+      <w:bookmarkStart w:id="21" w:name="what-this-package-is"/>
       <w:r>
         <w:t xml:space="preserve">What this package is</w:t>
       </w:r>
+      <w:bookmarkEnd w:id="21"/>
     </w:p>
     <w:p>
       <w:pPr>
@@ -144,7 +141,6 @@
       </w:pPr>
       <w:r>
         <w:rPr>
-          <w:bCs/>
           <w:b/>
         </w:rPr>
         <w:t xml:space="preserve">Scope constraint honoured:</w:t>
@@ -181,22 +177,21 @@
         </w:pict>
       </w:r>
     </w:p>
-    <w:bookmarkEnd w:id="20"/>
-    <w:bookmarkStart w:id="21" w:name="contents"/>
     <w:p>
       <w:pPr>
         <w:pStyle w:val="Heading2"/>
       </w:pPr>
+      <w:bookmarkStart w:id="22" w:name="contents"/>
       <w:r>
         <w:t xml:space="preserve">Contents</w:t>
       </w:r>
+      <w:bookmarkEnd w:id="22"/>
     </w:p>
     <w:tbl>
       <w:tblPr>
         <w:tblStyle w:val="Table"/>
-        <w:tblW w:type="auto" w:w="0"/>
-        <w:tblLook w:firstRow="1" w:lastRow="0" w:firstColumn="0" w:lastColumn="0" w:noHBand="0" w:noVBand="0" w:val="0020"/>
-        <w:jc w:val="start"/>
+        <w:tblW w:type="pct" w:w="5000.0"/>
+        <w:tblLook w:firstRow="1"/>
       </w:tblPr>
       <w:tblGrid>
         <w:gridCol w:w="2640"/>
@@ -205,10 +200,15 @@
       </w:tblGrid>
       <w:tr>
         <w:trPr>
-          <w:tblHeader w:val="true"/>
+          <w:cnfStyle w:firstRow="1"/>
         </w:trPr>
         <w:tc>
-          <w:tcPr/>
+          <w:tcPr>
+            <w:tcBorders>
+              <w:bottom w:val="single"/>
+            </w:tcBorders>
+            <w:vAlign w:val="bottom"/>
+          </w:tcPr>
           <w:p>
             <w:pPr>
               <w:pStyle w:val="Compact"/>
@@ -220,7 +220,12 @@
           </w:p>
         </w:tc>
         <w:tc>
-          <w:tcPr/>
+          <w:tcPr>
+            <w:tcBorders>
+              <w:bottom w:val="single"/>
+            </w:tcBorders>
+            <w:vAlign w:val="bottom"/>
+          </w:tcPr>
           <w:p>
             <w:pPr>
               <w:pStyle w:val="Compact"/>
@@ -232,7 +237,12 @@
           </w:p>
         </w:tc>
         <w:tc>
-          <w:tcPr/>
+          <w:tcPr>
+            <w:tcBorders>
+              <w:bottom w:val="single"/>
+            </w:tcBorders>
+            <w:vAlign w:val="bottom"/>
+          </w:tcPr>
           <w:p>
             <w:pPr>
               <w:pStyle w:val="Compact"/>
@@ -246,7 +256,6 @@
       </w:tr>
       <w:tr>
         <w:tc>
-          <w:tcPr/>
           <w:p>
             <w:pPr>
               <w:pStyle w:val="Compact"/>
@@ -258,7 +267,6 @@
           </w:p>
         </w:tc>
         <w:tc>
-          <w:tcPr/>
           <w:p>
             <w:pPr>
               <w:pStyle w:val="Compact"/>
@@ -266,7 +274,6 @@
             </w:pPr>
             <w:r>
               <w:rPr>
-                <w:bCs/>
                 <w:b/>
               </w:rPr>
               <w:t xml:space="preserve">00 — Overview</w:t>
@@ -274,7 +281,6 @@
           </w:p>
         </w:tc>
         <w:tc>
-          <w:tcPr/>
           <w:p>
             <w:pPr>
               <w:pStyle w:val="Compact"/>
@@ -288,7 +294,6 @@
       </w:tr>
       <w:tr>
         <w:tc>
-          <w:tcPr/>
           <w:p>
             <w:pPr>
               <w:pStyle w:val="Compact"/>
@@ -300,7 +305,6 @@
           </w:p>
         </w:tc>
         <w:tc>
-          <w:tcPr/>
           <w:p>
             <w:pPr>
               <w:pStyle w:val="Compact"/>
@@ -308,7 +312,6 @@
             </w:pPr>
             <w:r>
               <w:rPr>
-                <w:bCs/>
                 <w:b/>
               </w:rPr>
               <w:t xml:space="preserve">01 — Baseline Assessment</w:t>
@@ -316,7 +319,6 @@
           </w:p>
         </w:tc>
         <w:tc>
-          <w:tcPr/>
           <w:p>
             <w:pPr>
               <w:pStyle w:val="Compact"/>
@@ -330,7 +332,6 @@
       </w:tr>
       <w:tr>
         <w:tc>
-          <w:tcPr/>
           <w:p>
             <w:pPr>
               <w:pStyle w:val="Compact"/>
@@ -342,7 +343,6 @@
           </w:p>
         </w:tc>
         <w:tc>
-          <w:tcPr/>
           <w:p>
             <w:pPr>
               <w:pStyle w:val="Compact"/>
@@ -350,7 +350,6 @@
             </w:pPr>
             <w:r>
               <w:rPr>
-                <w:bCs/>
                 <w:b/>
               </w:rPr>
               <w:t xml:space="preserve">02 — The Runbook</w:t>
@@ -358,7 +357,6 @@
           </w:p>
         </w:tc>
         <w:tc>
-          <w:tcPr/>
           <w:p>
             <w:pPr>
               <w:pStyle w:val="Compact"/>
@@ -372,7 +370,6 @@
             </w:r>
             <w:r>
               <w:rPr>
-                <w:bCs/>
                 <w:b/>
               </w:rPr>
               <w:t xml:space="preserve">and why</w:t>
@@ -385,7 +382,6 @@
       </w:tr>
       <w:tr>
         <w:tc>
-          <w:tcPr/>
           <w:p>
             <w:pPr>
               <w:pStyle w:val="Compact"/>
@@ -397,7 +393,6 @@
           </w:p>
         </w:tc>
         <w:tc>
-          <w:tcPr/>
           <w:p>
             <w:pPr>
               <w:pStyle w:val="Compact"/>
@@ -405,7 +400,6 @@
             </w:pPr>
             <w:r>
               <w:rPr>
-                <w:bCs/>
                 <w:b/>
               </w:rPr>
               <w:t xml:space="preserve">03 — Evidence &amp; Rubric Traceability</w:t>
@@ -413,7 +407,6 @@
           </w:p>
         </w:tc>
         <w:tc>
-          <w:tcPr/>
           <w:p>
             <w:pPr>
               <w:pStyle w:val="Compact"/>
@@ -427,7 +420,6 @@
             </w:r>
             <w:r>
               <w:rPr>
-                <w:bCs/>
                 <w:b/>
               </w:rPr>
               <w:t xml:space="preserve">cannot yet satisfy</w:t>
@@ -440,7 +432,6 @@
       </w:tr>
       <w:tr>
         <w:tc>
-          <w:tcPr/>
           <w:p>
             <w:pPr>
               <w:pStyle w:val="Compact"/>
@@ -452,7 +443,6 @@
           </w:p>
         </w:tc>
         <w:tc>
-          <w:tcPr/>
           <w:p>
             <w:pPr>
               <w:pStyle w:val="Compact"/>
@@ -460,7 +450,6 @@
             </w:pPr>
             <w:r>
               <w:rPr>
-                <w:bCs/>
                 <w:b/>
               </w:rPr>
               <w:t xml:space="preserve">04 — Open Questions Register</w:t>
@@ -468,7 +457,6 @@
           </w:p>
         </w:tc>
         <w:tc>
-          <w:tcPr/>
           <w:p>
             <w:pPr>
               <w:pStyle w:val="Compact"/>
@@ -523,15 +511,15 @@
         </w:pict>
       </w:r>
     </w:p>
-    <w:bookmarkEnd w:id="21"/>
-    <w:bookmarkStart w:id="22" w:name="X21c6d67a7ea0f8fa796a1ec8558159bf55d0680"/>
     <w:p>
       <w:pPr>
         <w:pStyle w:val="Heading2"/>
       </w:pPr>
+      <w:bookmarkStart w:id="23" w:name="X21c6d67a7ea0f8fa796a1ec8558159bf55d0680"/>
       <w:r>
         <w:t xml:space="preserve">The three things to know before reading further</w:t>
       </w:r>
+      <w:bookmarkEnd w:id="23"/>
     </w:p>
     <w:p>
       <w:pPr>
@@ -539,7 +527,6 @@
       </w:pPr>
       <w:r>
         <w:rPr>
-          <w:bCs/>
           <w:b/>
         </w:rPr>
         <w:t xml:space="preserve">1. The repository is not under version control.</w:t>
@@ -564,24 +551,33 @@
       </w:r>
       <w:r>
         <w:rPr>
-          <w:iCs/>
           <w:i/>
         </w:rPr>
-        <w:t xml:space="preserve">"fatal: not a git</w:t>
-      </w:r>
-      <w:r>
-        <w:rPr>
-          <w:iCs/>
+        <w:t xml:space="preserve">“</w:t>
+      </w:r>
+      <w:r>
+        <w:rPr>
           <w:i/>
         </w:rPr>
-        <w:t xml:space="preserve"> </w:t>
-      </w:r>
-      <w:r>
-        <w:rPr>
-          <w:iCs/>
+        <w:t xml:space="preserve">fatal: not a git</w:t>
+      </w:r>
+      <w:r>
+        <w:rPr>
           <w:i/>
         </w:rPr>
-        <w:t xml:space="preserve">repository"</w:t>
+        <w:t xml:space="preserve"> </w:t>
+      </w:r>
+      <w:r>
+        <w:rPr>
+          <w:i/>
+        </w:rPr>
+        <w:t xml:space="preserve">repository</w:t>
+      </w:r>
+      <w:r>
+        <w:rPr>
+          <w:i/>
+        </w:rPr>
+        <w:t xml:space="preserve">”</w:t>
       </w:r>
       <w:r>
         <w:t xml:space="preserve">. The Delivery Spine requires every artifact to be version-controlled, to never</w:t>
@@ -611,16 +607,15 @@
       </w:pPr>
       <w:r>
         <w:rPr>
-          <w:bCs/>
           <w:b/>
         </w:rPr>
-        <w:t xml:space="preserve">2. The system's deficiency is provability, not just code quality.</w:t>
-      </w:r>
-      <w:r>
-        <w:t xml:space="preserve"> </w:t>
-      </w:r>
-      <w:r>
-        <w:t xml:space="preserve">About one third (32.8%) of the event stream carries no correlation ID. The audit record has no actor. The audit sink is a local file</w:t>
+        <w:t xml:space="preserve">2. The system’s deficiency is provability, not just code quality.</w:t>
+      </w:r>
+      <w:r>
+        <w:t xml:space="preserve"> </w:t>
+      </w:r>
+      <w:r>
+        <w:t xml:space="preserve">About two thirds (66.4%) of the event stream carries no usable correlation ID. The audit record has no actor. The audit sink is a local file</w:t>
       </w:r>
       <w:r>
         <w:t xml:space="preserve"> </w:t>
@@ -647,7 +642,6 @@
       </w:pPr>
       <w:r>
         <w:rPr>
-          <w:bCs/>
           <w:b/>
         </w:rPr>
         <w:t xml:space="preserve">3. The findings and the marks are not in the same place.</w:t>
@@ -690,15 +684,15 @@
         </w:pict>
       </w:r>
     </w:p>
-    <w:bookmarkEnd w:id="22"/>
-    <w:bookmarkStart w:id="23" w:name="Xa6848bdf13faa5c05cf164553ecf8bab55d877f"/>
     <w:p>
       <w:pPr>
         <w:pStyle w:val="Heading2"/>
       </w:pPr>
+      <w:bookmarkStart w:id="24" w:name="Xa6848bdf13faa5c05cf164553ecf8bab55d877f"/>
       <w:r>
         <w:t xml:space="preserve">The five decisions needed from the CTO first</w:t>
       </w:r>
+      <w:bookmarkEnd w:id="24"/>
     </w:p>
     <w:p>
       <w:pPr>
@@ -710,7 +704,6 @@
       </w:pPr>
       <w:r>
         <w:rPr>
-          <w:bCs/>
           <w:b/>
         </w:rPr>
         <w:t xml:space="preserve">OQ-11</w:t>
@@ -738,7 +731,6 @@
       </w:pPr>
       <w:r>
         <w:rPr>
-          <w:bCs/>
           <w:b/>
         </w:rPr>
         <w:t xml:space="preserve">OQ-05</w:t>
@@ -766,7 +758,6 @@
       </w:pPr>
       <w:r>
         <w:rPr>
-          <w:bCs/>
           <w:b/>
         </w:rPr>
         <w:t xml:space="preserve">OQ-02</w:t>
@@ -775,7 +766,7 @@
         <w:t xml:space="preserve"> </w:t>
       </w:r>
       <w:r>
-        <w:t xml:space="preserve">— Which two models? The Challenge Guide's second-model comparison cannot be</w:t>
+        <w:t xml:space="preserve">— Which two models? The Challenge Guide’s second-model comparison cannot be</w:t>
       </w:r>
       <w:r>
         <w:t xml:space="preserve"> </w:t>
@@ -794,7 +785,6 @@
       </w:pPr>
       <w:r>
         <w:rPr>
-          <w:bCs/>
           <w:b/>
         </w:rPr>
         <w:t xml:space="preserve">OQ-01</w:t>
@@ -822,7 +812,6 @@
       </w:pPr>
       <w:r>
         <w:rPr>
-          <w:bCs/>
           <w:b/>
         </w:rPr>
         <w:t xml:space="preserve">OQ-12</w:t>
@@ -842,8 +831,6 @@
         <w:t xml:space="preserve">Full detail, with recommended defaults for each, in Document 04.</w:t>
       </w:r>
     </w:p>
-    <w:bookmarkEnd w:id="23"/>
-    <w:bookmarkEnd w:id="24"/>
     <w:sectPr/>
   </w:body>
 </w:document>
@@ -875,14 +862,17 @@
 <file path=word/numbering.xml><?xml version="1.0" encoding="utf-8"?>
 <w:numbering xmlns:w="http://schemas.openxmlformats.org/wordprocessingml/2006/main">
   <w:abstractNum w:abstractNumId="990">
-    <w:nsid w:val="A990"/>
+    <w:nsid w:val="2c1ae401"/>
     <w:multiLevelType w:val="multilevel"/>
     <w:lvl w:ilvl="0">
       <w:numFmt w:val="bullet"/>
       <w:lvlText w:val=" "/>
       <w:lvlJc w:val="left"/>
       <w:pPr>
-        <w:ind w:left="720" w:hanging="480"/>
+        <w:tabs>
+          <w:tab w:val="num" w:pos="0"/>
+        </w:tabs>
+        <w:ind w:left="480" w:hanging="480"/>
       </w:pPr>
     </w:lvl>
     <w:lvl w:ilvl="1">
@@ -890,7 +880,10 @@
       <w:lvlText w:val=" "/>
       <w:lvlJc w:val="left"/>
       <w:pPr>
-        <w:ind w:left="1440" w:hanging="480"/>
+        <w:tabs>
+          <w:tab w:val="num" w:pos="720"/>
+        </w:tabs>
+        <w:ind w:left="1200" w:hanging="480"/>
       </w:pPr>
     </w:lvl>
     <w:lvl w:ilvl="2">
@@ -898,7 +891,10 @@
       <w:lvlText w:val=" "/>
       <w:lvlJc w:val="left"/>
       <w:pPr>
-        <w:ind w:left="2160" w:hanging="480"/>
+        <w:tabs>
+          <w:tab w:val="num" w:pos="1440"/>
+        </w:tabs>
+        <w:ind w:left="1920" w:hanging="480"/>
       </w:pPr>
     </w:lvl>
     <w:lvl w:ilvl="3">
@@ -906,7 +902,10 @@
       <w:lvlText w:val=" "/>
       <w:lvlJc w:val="left"/>
       <w:pPr>
-        <w:ind w:left="2880" w:hanging="480"/>
+        <w:tabs>
+          <w:tab w:val="num" w:pos="2160"/>
+        </w:tabs>
+        <w:ind w:left="2640" w:hanging="480"/>
       </w:pPr>
     </w:lvl>
     <w:lvl w:ilvl="4">
@@ -914,7 +913,10 @@
       <w:lvlText w:val=" "/>
       <w:lvlJc w:val="left"/>
       <w:pPr>
-        <w:ind w:left="3600" w:hanging="480"/>
+        <w:tabs>
+          <w:tab w:val="num" w:pos="2880"/>
+        </w:tabs>
+        <w:ind w:left="3360" w:hanging="480"/>
       </w:pPr>
     </w:lvl>
     <w:lvl w:ilvl="5">
@@ -922,7 +924,10 @@
       <w:lvlText w:val=" "/>
       <w:lvlJc w:val="left"/>
       <w:pPr>
-        <w:ind w:left="4320" w:hanging="480"/>
+        <w:tabs>
+          <w:tab w:val="num" w:pos="3600"/>
+        </w:tabs>
+        <w:ind w:left="4080" w:hanging="480"/>
       </w:pPr>
     </w:lvl>
     <w:lvl w:ilvl="6">
@@ -930,7 +935,10 @@
       <w:lvlText w:val=" "/>
       <w:lvlJc w:val="left"/>
       <w:pPr>
-        <w:ind w:left="5040" w:hanging="480"/>
+        <w:tabs>
+          <w:tab w:val="num" w:pos="4320"/>
+        </w:tabs>
+        <w:ind w:left="4800" w:hanging="480"/>
       </w:pPr>
     </w:lvl>
     <w:lvl w:ilvl="7">
@@ -938,7 +946,10 @@
       <w:lvlText w:val=" "/>
       <w:lvlJc w:val="left"/>
       <w:pPr>
-        <w:ind w:left="5760" w:hanging="480"/>
+        <w:tabs>
+          <w:tab w:val="num" w:pos="5040"/>
+        </w:tabs>
+        <w:ind w:left="5520" w:hanging="480"/>
       </w:pPr>
     </w:lvl>
     <w:lvl w:ilvl="8">
@@ -946,12 +957,15 @@
       <w:lvlText w:val=" "/>
       <w:lvlJc w:val="left"/>
       <w:pPr>
-        <w:ind w:left="6480" w:hanging="480"/>
+        <w:tabs>
+          <w:tab w:val="num" w:pos="5760"/>
+        </w:tabs>
+        <w:ind w:left="6240" w:hanging="480"/>
       </w:pPr>
     </w:lvl>
   </w:abstractNum>
   <w:abstractNum w:abstractNumId="99411">
-    <w:nsid w:val="A99411"/>
+    <w:nsid w:val="ea454b4c"/>
     <w:multiLevelType w:val="multilevel"/>
     <w:lvl w:ilvl="0">
       <w:start w:val="1"/>
@@ -959,7 +973,10 @@
       <w:lvlText w:val="%1."/>
       <w:lvlJc w:val="left"/>
       <w:pPr>
-        <w:ind w:left="720" w:hanging="480"/>
+        <w:tabs>
+          <w:tab w:val="num" w:pos="0"/>
+        </w:tabs>
+        <w:ind w:left="480" w:hanging="480"/>
       </w:pPr>
     </w:lvl>
     <w:lvl w:ilvl="1">
@@ -968,7 +985,10 @@
       <w:lvlText w:val="%2."/>
       <w:lvlJc w:val="left"/>
       <w:pPr>
-        <w:ind w:left="1440" w:hanging="480"/>
+        <w:tabs>
+          <w:tab w:val="num" w:pos="720"/>
+        </w:tabs>
+        <w:ind w:left="1200" w:hanging="480"/>
       </w:pPr>
     </w:lvl>
     <w:lvl w:ilvl="2">
@@ -977,7 +997,10 @@
       <w:lvlText w:val="%3."/>
       <w:lvlJc w:val="left"/>
       <w:pPr>
-        <w:ind w:left="2160" w:hanging="480"/>
+        <w:tabs>
+          <w:tab w:val="num" w:pos="1440"/>
+        </w:tabs>
+        <w:ind w:left="1920" w:hanging="480"/>
       </w:pPr>
     </w:lvl>
     <w:lvl w:ilvl="3">
@@ -986,7 +1009,10 @@
       <w:lvlText w:val="%4."/>
       <w:lvlJc w:val="left"/>
       <w:pPr>
-        <w:ind w:left="2880" w:hanging="480"/>
+        <w:tabs>
+          <w:tab w:val="num" w:pos="2160"/>
+        </w:tabs>
+        <w:ind w:left="2640" w:hanging="480"/>
       </w:pPr>
     </w:lvl>
     <w:lvl w:ilvl="4">
@@ -995,7 +1021,10 @@
       <w:lvlText w:val="%5."/>
       <w:lvlJc w:val="left"/>
       <w:pPr>
-        <w:ind w:left="3600" w:hanging="480"/>
+        <w:tabs>
+          <w:tab w:val="num" w:pos="2880"/>
+        </w:tabs>
+        <w:ind w:left="3360" w:hanging="480"/>
       </w:pPr>
     </w:lvl>
     <w:lvl w:ilvl="5">
@@ -1004,7 +1033,10 @@
       <w:lvlText w:val="%6."/>
       <w:lvlJc w:val="left"/>
       <w:pPr>
-        <w:ind w:left="4320" w:hanging="480"/>
+        <w:tabs>
+          <w:tab w:val="num" w:pos="3600"/>
+        </w:tabs>
+        <w:ind w:left="4080" w:hanging="480"/>
       </w:pPr>
     </w:lvl>
     <w:lvl w:ilvl="6">
@@ -1013,7 +1045,10 @@
       <w:lvlText w:val="%7."/>
       <w:lvlJc w:val="left"/>
       <w:pPr>
-        <w:ind w:left="5040" w:hanging="480"/>
+        <w:tabs>
+          <w:tab w:val="num" w:pos="4320"/>
+        </w:tabs>
+        <w:ind w:left="4800" w:hanging="480"/>
       </w:pPr>
     </w:lvl>
     <w:lvl w:ilvl="7">
@@ -1022,7 +1057,10 @@
       <w:lvlText w:val="%8."/>
       <w:lvlJc w:val="left"/>
       <w:pPr>
-        <w:ind w:left="5760" w:hanging="480"/>
+        <w:tabs>
+          <w:tab w:val="num" w:pos="5040"/>
+        </w:tabs>
+        <w:ind w:left="5520" w:hanging="480"/>
       </w:pPr>
     </w:lvl>
     <w:lvl w:ilvl="8">
@@ -1031,7 +1069,10 @@
       <w:lvlText w:val="%9."/>
       <w:lvlJc w:val="left"/>
       <w:pPr>
-        <w:ind w:left="6480" w:hanging="480"/>
+        <w:tabs>
+          <w:tab w:val="num" w:pos="5760"/>
+        </w:tabs>
+        <w:ind w:left="6240" w:hanging="480"/>
       </w:pPr>
     </w:lvl>
   </w:abstractNum>
@@ -1076,10 +1117,10 @@
   <w:docDefaults>
     <w:rPrDefault>
       <w:rPr>
-        <w:rFonts w:asciiTheme="minorHAnsi" w:cstheme="minorBidi" w:eastAsiaTheme="minorHAnsi" w:hAnsiTheme="minorHAnsi"/>
+        <w:rFonts w:asciiTheme="minorHAnsi" w:eastAsiaTheme="minorHAnsi" w:hAnsiTheme="minorHAnsi" w:cstheme="minorBidi"/>
         <w:sz w:val="24"/>
         <w:szCs w:val="24"/>
-        <w:lang w:bidi="ar-SA" w:eastAsia="en-US" w:val="en-US"/>
+        <w:lang w:val="en-US" w:eastAsia="en-US" w:bidi="ar-SA"/>
       </w:rPr>
     </w:rPrDefault>
     <w:pPrDefault>
@@ -1088,35 +1129,35 @@
       </w:pPr>
     </w:pPrDefault>
   </w:docDefaults>
-  <w:latentStyles w:count="276" w:defLockedState="0" w:defQFormat="0" w:defSemiHidden="0" w:defUIPriority="0" w:defUnhideWhenUsed="0"/>
-  <w:style w:default="1" w:styleId="Normal" w:type="paragraph">
+  <w:latentStyles w:defLockedState="0" w:defUIPriority="0" w:defSemiHidden="0" w:defUnhideWhenUsed="0" w:defQFormat="0" w:count="276"/>
+  <w:style w:type="paragraph" w:default="1" w:styleId="Normal">
     <w:name w:val="Normal"/>
     <w:qFormat/>
   </w:style>
-  <w:style w:styleId="BodyText" w:type="paragraph">
+  <w:style w:type="paragraph" w:styleId="BodyText">
     <w:name w:val="Body Text"/>
     <w:basedOn w:val="Normal"/>
     <w:link w:val="BodyTextChar"/>
     <w:pPr>
-      <w:spacing w:after="180" w:before="180"/>
-    </w:pPr>
-    <w:qFormat/>
-  </w:style>
-  <w:style w:customStyle="1" w:styleId="FirstParagraph" w:type="paragraph">
+      <w:spacing w:before="180" w:after="180"/>
+    </w:pPr>
+    <w:qFormat/>
+  </w:style>
+  <w:style w:type="paragraph" w:customStyle="1" w:styleId="FirstParagraph">
     <w:name w:val="First Paragraph"/>
     <w:basedOn w:val="BodyText"/>
     <w:next w:val="BodyText"/>
     <w:qFormat/>
   </w:style>
-  <w:style w:customStyle="1" w:styleId="Compact" w:type="paragraph">
+  <w:style w:type="paragraph" w:customStyle="1" w:styleId="Compact">
     <w:name w:val="Compact"/>
     <w:basedOn w:val="BodyText"/>
     <w:qFormat/>
     <w:pPr>
-      <w:spacing w:after="36" w:before="36"/>
-    </w:pPr>
-  </w:style>
-  <w:style w:styleId="Title" w:type="paragraph">
+      <w:spacing w:before="36" w:after="36"/>
+    </w:pPr>
+  </w:style>
+  <w:style w:type="paragraph" w:styleId="Title">
     <w:name w:val="Title"/>
     <w:basedOn w:val="Normal"/>
     <w:next w:val="BodyText"/>
@@ -1124,19 +1165,19 @@
     <w:pPr>
       <w:keepNext/>
       <w:keepLines/>
-      <w:spacing w:after="240" w:before="480"/>
+      <w:spacing w:before="480" w:after="240"/>
       <w:jc w:val="center"/>
     </w:pPr>
     <w:rPr>
-      <w:rFonts w:asciiTheme="majorHAnsi" w:cstheme="majorBidi" w:eastAsiaTheme="majorEastAsia" w:hAnsiTheme="majorHAnsi"/>
+      <w:rFonts w:asciiTheme="majorHAnsi" w:eastAsiaTheme="majorEastAsia" w:hAnsiTheme="majorHAnsi" w:cstheme="majorBidi"/>
       <w:b/>
       <w:bCs/>
-      <w:color w:themeColor="accent1" w:themeShade="B5" w:val="345A8A"/>
+      <w:color w:val="345A8A" w:themeColor="accent1" w:themeShade="B5"/>
       <w:sz w:val="36"/>
       <w:szCs w:val="36"/>
     </w:rPr>
   </w:style>
-  <w:style w:styleId="Subtitle" w:type="paragraph">
+  <w:style w:type="paragraph" w:styleId="Subtitle">
     <w:name w:val="Subtitle"/>
     <w:basedOn w:val="Title"/>
     <w:next w:val="BodyText"/>
@@ -1144,7 +1185,7 @@
     <w:pPr>
       <w:keepNext/>
       <w:keepLines/>
-      <w:spacing w:after="240" w:before="240"/>
+      <w:spacing w:before="240" w:after="240"/>
       <w:jc w:val="center"/>
     </w:pPr>
     <w:rPr>
@@ -1152,7 +1193,7 @@
       <w:szCs w:val="30"/>
     </w:rPr>
   </w:style>
-  <w:style w:customStyle="1" w:styleId="Author" w:type="paragraph">
+  <w:style w:type="paragraph" w:customStyle="1" w:styleId="Author">
     <w:name w:val="Author"/>
     <w:next w:val="BodyText"/>
     <w:qFormat/>
@@ -1162,7 +1203,7 @@
       <w:jc w:val="center"/>
     </w:pPr>
   </w:style>
-  <w:style w:styleId="Date" w:type="paragraph">
+  <w:style w:type="paragraph" w:styleId="Date">
     <w:name w:val="Date"/>
     <w:next w:val="BodyText"/>
     <w:qFormat/>
@@ -1172,26 +1213,7 @@
       <w:jc w:val="center"/>
     </w:pPr>
   </w:style>
-  <w:style w:customStyle="1" w:styleId="AbstractTitle" w:type="paragraph">
-    <w:name w:val="Abstract Title"/>
-    <w:basedOn w:val="Normal"/>
-    <w:next w:val="Abstract"/>
-    <w:qFormat/>
-    <w:pPr>
-      <w:keepNext/>
-      <w:keepLines/>
-      <w:jc w:val="center"/>
-      <w:spacing w:after="0" w:before="300"/>
-    </w:pPr>
-    <w:rPr>
-      <w:sz w:val="20"/>
-      <w:szCs w:val="20"/>
-      <w:b/>
-      <w:color w:val="345A8A"/>
-      &gt;
-    </w:rPr>
-  </w:style>
-  <w:style w:customStyle="1" w:styleId="Abstract" w:type="paragraph">
+  <w:style w:type="paragraph" w:customStyle="1" w:styleId="Abstract">
     <w:name w:val="Abstract"/>
     <w:basedOn w:val="Normal"/>
     <w:next w:val="BodyText"/>
@@ -1199,14 +1221,14 @@
     <w:pPr>
       <w:keepNext/>
       <w:keepLines/>
-      <w:spacing w:after="300" w:before="100"/>
+      <w:spacing w:before="300" w:after="300"/>
     </w:pPr>
     <w:rPr>
       <w:sz w:val="20"/>
       <w:szCs w:val="20"/>
     </w:rPr>
   </w:style>
-  <w:style w:styleId="Bibliography" w:type="paragraph">
+  <w:style w:type="paragraph" w:styleId="Bibliography">
     <w:name w:val="Bibliography"/>
     <w:basedOn w:val="Normal"/>
     <w:next w:val="Bibliography"/>
@@ -1214,7 +1236,7 @@
     <w:pPr/>
     <w:rPr/>
   </w:style>
-  <w:style w:styleId="Heading1" w:type="paragraph">
+  <w:style w:type="paragraph" w:styleId="Heading1">
     <w:name w:val="Heading 1"/>
     <w:basedOn w:val="Normal"/>
     <w:next w:val="BodyText"/>
@@ -1223,19 +1245,19 @@
     <w:pPr>
       <w:keepNext/>
       <w:keepLines/>
-      <w:spacing w:after="0" w:before="480"/>
+      <w:spacing w:before="480" w:after="0"/>
       <w:outlineLvl w:val="0"/>
     </w:pPr>
     <w:rPr>
-      <w:rFonts w:asciiTheme="majorHAnsi" w:cstheme="majorBidi" w:eastAsiaTheme="majorEastAsia" w:hAnsiTheme="majorHAnsi"/>
+      <w:rFonts w:asciiTheme="majorHAnsi" w:eastAsiaTheme="majorEastAsia" w:hAnsiTheme="majorHAnsi" w:cstheme="majorBidi"/>
       <w:b/>
       <w:bCs/>
-      <w:color w:themeColor="accent1" w:val="4F81BD"/>
+      <w:color w:val="4F81BD" w:themeColor="accent1"/>
       <w:sz w:val="32"/>
       <w:szCs w:val="32"/>
     </w:rPr>
   </w:style>
-  <w:style w:styleId="Heading2" w:type="paragraph">
+  <w:style w:type="paragraph" w:styleId="Heading2">
     <w:name w:val="Heading 2"/>
     <w:basedOn w:val="Normal"/>
     <w:next w:val="BodyText"/>
@@ -1245,19 +1267,19 @@
     <w:pPr>
       <w:keepNext/>
       <w:keepLines/>
-      <w:spacing w:after="0" w:before="200"/>
+      <w:spacing w:before="200" w:after="0"/>
       <w:outlineLvl w:val="1"/>
     </w:pPr>
     <w:rPr>
-      <w:rFonts w:asciiTheme="majorHAnsi" w:cstheme="majorBidi" w:eastAsiaTheme="majorEastAsia" w:hAnsiTheme="majorHAnsi"/>
+      <w:rFonts w:asciiTheme="majorHAnsi" w:eastAsiaTheme="majorEastAsia" w:hAnsiTheme="majorHAnsi" w:cstheme="majorBidi"/>
       <w:b/>
       <w:bCs/>
-      <w:color w:themeColor="accent1" w:val="4F81BD"/>
+      <w:color w:val="4F81BD" w:themeColor="accent1"/>
       <w:sz w:val="28"/>
       <w:szCs w:val="28"/>
     </w:rPr>
   </w:style>
-  <w:style w:styleId="Heading3" w:type="paragraph">
+  <w:style w:type="paragraph" w:styleId="Heading3">
     <w:name w:val="Heading 3"/>
     <w:basedOn w:val="Normal"/>
     <w:next w:val="BodyText"/>
@@ -1267,19 +1289,19 @@
     <w:pPr>
       <w:keepNext/>
       <w:keepLines/>
-      <w:spacing w:after="0" w:before="200"/>
+      <w:spacing w:before="200" w:after="0"/>
       <w:outlineLvl w:val="2"/>
     </w:pPr>
     <w:rPr>
-      <w:rFonts w:asciiTheme="majorHAnsi" w:cstheme="majorBidi" w:eastAsiaTheme="majorEastAsia" w:hAnsiTheme="majorHAnsi"/>
+      <w:rFonts w:asciiTheme="majorHAnsi" w:eastAsiaTheme="majorEastAsia" w:hAnsiTheme="majorHAnsi" w:cstheme="majorBidi"/>
       <w:b/>
       <w:bCs/>
-      <w:color w:themeColor="accent1" w:val="4F81BD"/>
+      <w:color w:val="4F81BD" w:themeColor="accent1"/>
       <w:sz w:val="24"/>
       <w:szCs w:val="24"/>
     </w:rPr>
   </w:style>
-  <w:style w:styleId="Heading4" w:type="paragraph">
+  <w:style w:type="paragraph" w:styleId="Heading4">
     <w:name w:val="Heading 4"/>
     <w:basedOn w:val="Normal"/>
     <w:next w:val="BodyText"/>
@@ -1289,19 +1311,19 @@
     <w:pPr>
       <w:keepNext/>
       <w:keepLines/>
-      <w:spacing w:after="0" w:before="200"/>
+      <w:spacing w:before="200" w:after="0"/>
       <w:outlineLvl w:val="3"/>
     </w:pPr>
     <w:rPr>
-      <w:rFonts w:asciiTheme="majorHAnsi" w:cstheme="majorBidi" w:eastAsiaTheme="majorEastAsia" w:hAnsiTheme="majorHAnsi"/>
+      <w:rFonts w:asciiTheme="majorHAnsi" w:eastAsiaTheme="majorEastAsia" w:hAnsiTheme="majorHAnsi" w:cstheme="majorBidi"/>
       <w:i/>
       <w:bCs/>
-      <w:color w:themeColor="accent1" w:val="4F81BD"/>
+      <w:color w:val="4F81BD" w:themeColor="accent1"/>
       <w:sz w:val="24"/>
       <w:szCs w:val="24"/>
     </w:rPr>
   </w:style>
-  <w:style w:styleId="Heading5" w:type="paragraph">
+  <w:style w:type="paragraph" w:styleId="Heading5">
     <w:name w:val="Heading 5"/>
     <w:basedOn w:val="Normal"/>
     <w:next w:val="BodyText"/>
@@ -1311,18 +1333,18 @@
     <w:pPr>
       <w:keepNext/>
       <w:keepLines/>
-      <w:spacing w:after="0" w:before="200"/>
+      <w:spacing w:before="200" w:after="0"/>
       <w:outlineLvl w:val="4"/>
     </w:pPr>
     <w:rPr>
-      <w:rFonts w:asciiTheme="majorHAnsi" w:cstheme="majorBidi" w:eastAsiaTheme="majorEastAsia" w:hAnsiTheme="majorHAnsi"/>
+      <w:rFonts w:asciiTheme="majorHAnsi" w:eastAsiaTheme="majorEastAsia" w:hAnsiTheme="majorHAnsi" w:cstheme="majorBidi"/>
       <w:iCs/>
-      <w:color w:themeColor="accent1" w:val="4F81BD"/>
+      <w:color w:val="4F81BD" w:themeColor="accent1"/>
       <w:sz w:val="24"/>
       <w:szCs w:val="24"/>
     </w:rPr>
   </w:style>
-  <w:style w:styleId="Heading6" w:type="paragraph">
+  <w:style w:type="paragraph" w:styleId="Heading6">
     <w:name w:val="Heading 6"/>
     <w:basedOn w:val="Normal"/>
     <w:next w:val="BodyText"/>
@@ -1332,17 +1354,17 @@
     <w:pPr>
       <w:keepNext/>
       <w:keepLines/>
-      <w:spacing w:after="0" w:before="200"/>
+      <w:spacing w:before="200" w:after="0"/>
       <w:outlineLvl w:val="5"/>
     </w:pPr>
     <w:rPr>
-      <w:rFonts w:asciiTheme="majorHAnsi" w:cstheme="majorBidi" w:eastAsiaTheme="majorEastAsia" w:hAnsiTheme="majorHAnsi"/>
-      <w:color w:themeColor="accent1" w:val="4F81BD"/>
+      <w:rFonts w:asciiTheme="majorHAnsi" w:eastAsiaTheme="majorEastAsia" w:hAnsiTheme="majorHAnsi" w:cstheme="majorBidi"/>
+      <w:color w:val="4F81BD" w:themeColor="accent1"/>
       <w:sz w:val="24"/>
       <w:szCs w:val="24"/>
     </w:rPr>
   </w:style>
-  <w:style w:styleId="Heading7" w:type="paragraph">
+  <w:style w:type="paragraph" w:styleId="Heading7">
     <w:name w:val="Heading 7"/>
     <w:basedOn w:val="Normal"/>
     <w:next w:val="BodyText"/>
@@ -1352,17 +1374,17 @@
     <w:pPr>
       <w:keepNext/>
       <w:keepLines/>
-      <w:spacing w:after="0" w:before="200"/>
+      <w:spacing w:before="200" w:after="0"/>
       <w:outlineLvl w:val="6"/>
     </w:pPr>
     <w:rPr>
-      <w:rFonts w:asciiTheme="majorHAnsi" w:cstheme="majorBidi" w:eastAsiaTheme="majorEastAsia" w:hAnsiTheme="majorHAnsi"/>
-      <w:color w:themeColor="accent1" w:val="4F81BD"/>
+      <w:rFonts w:asciiTheme="majorHAnsi" w:eastAsiaTheme="majorEastAsia" w:hAnsiTheme="majorHAnsi" w:cstheme="majorBidi"/>
+      <w:color w:val="4F81BD" w:themeColor="accent1"/>
       <w:sz w:val="24"/>
       <w:szCs w:val="24"/>
     </w:rPr>
   </w:style>
-  <w:style w:styleId="Heading8" w:type="paragraph">
+  <w:style w:type="paragraph" w:styleId="Heading8">
     <w:name w:val="Heading 8"/>
     <w:basedOn w:val="Normal"/>
     <w:next w:val="BodyText"/>
@@ -1372,17 +1394,17 @@
     <w:pPr>
       <w:keepNext/>
       <w:keepLines/>
-      <w:spacing w:after="0" w:before="200"/>
+      <w:spacing w:before="200" w:after="0"/>
       <w:outlineLvl w:val="7"/>
     </w:pPr>
     <w:rPr>
-      <w:rFonts w:asciiTheme="majorHAnsi" w:cstheme="majorBidi" w:eastAsiaTheme="majorEastAsia" w:hAnsiTheme="majorHAnsi"/>
-      <w:color w:themeColor="accent1" w:val="4F81BD"/>
+      <w:rFonts w:asciiTheme="majorHAnsi" w:eastAsiaTheme="majorEastAsia" w:hAnsiTheme="majorHAnsi" w:cstheme="majorBidi"/>
+      <w:color w:val="4F81BD" w:themeColor="accent1"/>
       <w:sz w:val="24"/>
       <w:szCs w:val="24"/>
     </w:rPr>
   </w:style>
-  <w:style w:styleId="Heading9" w:type="paragraph">
+  <w:style w:type="paragraph" w:styleId="Heading9">
     <w:name w:val="Heading 9"/>
     <w:basedOn w:val="Normal"/>
     <w:next w:val="BodyText"/>
@@ -1392,17 +1414,17 @@
     <w:pPr>
       <w:keepNext/>
       <w:keepLines/>
-      <w:spacing w:after="0" w:before="200"/>
+      <w:spacing w:before="200" w:after="0"/>
       <w:outlineLvl w:val="8"/>
     </w:pPr>
     <w:rPr>
-      <w:rFonts w:asciiTheme="majorHAnsi" w:cstheme="majorBidi" w:eastAsiaTheme="majorEastAsia" w:hAnsiTheme="majorHAnsi"/>
-      <w:color w:themeColor="accent1" w:val="4F81BD"/>
+      <w:rFonts w:asciiTheme="majorHAnsi" w:eastAsiaTheme="majorEastAsia" w:hAnsiTheme="majorHAnsi" w:cstheme="majorBidi"/>
+      <w:color w:val="4F81BD" w:themeColor="accent1"/>
       <w:sz w:val="24"/>
       <w:szCs w:val="24"/>
     </w:rPr>
   </w:style>
-  <w:style w:styleId="BlockText" w:type="paragraph">
+  <w:style w:type="paragraph" w:styleId="BlockText">
     <w:name w:val="Block Text"/>
     <w:basedOn w:val="BodyText"/>
     <w:next w:val="BodyText"/>
@@ -1410,11 +1432,11 @@
     <w:unhideWhenUsed/>
     <w:qFormat/>
     <w:pPr>
-      <w:spacing w:after="100" w:before="100"/>
+      <w:spacing w:before="100" w:after="100"/>
       <w:ind w:firstLine="0" w:left="480" w:right="480"/>
     </w:pPr>
   </w:style>
-  <w:style w:styleId="FootnoteText" w:type="paragraph">
+  <w:style w:type="paragraph" w:styleId="FootnoteText">
     <w:name w:val="Footnote Text"/>
     <w:basedOn w:val="Normal"/>
     <w:next w:val="FootnoteText"/>
@@ -1422,43 +1444,28 @@
     <w:unhideWhenUsed/>
     <w:qFormat/>
   </w:style>
-  <w:style w:default="1" w:styleId="DefaultParagraphFont" w:type="character">
+  <w:style w:type="character" w:default="1" w:styleId="DefaultParagraphFont">
     <w:name w:val="Default Paragraph Font"/>
     <w:semiHidden/>
     <w:unhideWhenUsed/>
   </w:style>
-  <w:style w:default="1" w:styleId="Table" w:type="table">
+  <w:style w:type="table" w:default="1" w:styleId="Table">
     <w:name w:val="Table"/>
     <w:basedOn w:val="TableNormal"/>
     <w:semiHidden/>
     <w:unhideWhenUsed/>
     <w:qFormat/>
     <w:tblPr>
-      <w:tblInd w:type="dxa" w:w="0"/>
+      <w:tblInd w:w="0" w:type="dxa"/>
       <w:tblCellMar>
-        <w:top w:type="dxa" w:w="0"/>
-        <w:left w:type="dxa" w:w="108"/>
-        <w:bottom w:type="dxa" w:w="0"/>
-        <w:right w:type="dxa" w:w="108"/>
+        <w:top w:w="0" w:type="dxa"/>
+        <w:left w:w="108" w:type="dxa"/>
+        <w:bottom w:w="0" w:type="dxa"/>
+        <w:right w:w="108" w:type="dxa"/>
       </w:tblCellMar>
     </w:tblPr>
-    <w:tblStylePr w:type="firstRow">
-      <w:tblPr>
-        <w:jc w:val="left"/>
-        <w:tblInd w:type="dxa" w:w="0"/>
-      </w:tblPr>
-      <w:trPr>
-        <w:jc w:val="left"/>
-      </w:trPr>
-      <w:tcPr>
-        <w:vAlign w:val="bottom"/>
-        <w:tcBorders>
-          <w:bottom w:val="single"/>
-        </w:tcBorders>
-      </w:tcPr>
-    </w:tblStylePr>
-  </w:style>
-  <w:style w:customStyle="1" w:styleId="DefinitionTerm" w:type="paragraph">
+  </w:style>
+  <w:style w:type="paragraph" w:customStyle="1" w:styleId="DefinitionTerm">
     <w:name w:val="Definition Term"/>
     <w:basedOn w:val="Normal"/>
     <w:next w:val="Definition"/>
@@ -1471,49 +1478,49 @@
       <w:b/>
     </w:rPr>
   </w:style>
-  <w:style w:customStyle="1" w:styleId="Definition" w:type="paragraph">
+  <w:style w:type="paragraph" w:customStyle="1" w:styleId="Definition">
     <w:name w:val="Definition"/>
     <w:basedOn w:val="Normal"/>
   </w:style>
-  <w:style w:styleId="Caption" w:type="paragraph">
+  <w:style w:type="paragraph" w:styleId="Caption">
     <w:name w:val="Caption"/>
     <w:basedOn w:val="Normal"/>
     <w:link w:val="BodyTextChar"/>
     <w:pPr>
-      <w:spacing w:after="120" w:before="0"/>
+      <w:spacing w:before="0" w:after="120"/>
     </w:pPr>
     <w:rPr>
       <w:i/>
     </w:rPr>
   </w:style>
-  <w:style w:customStyle="1" w:styleId="TableCaption" w:type="paragraph">
+  <w:style w:type="paragraph" w:customStyle="1" w:styleId="TableCaption">
     <w:name w:val="Table Caption"/>
     <w:basedOn w:val="Caption"/>
     <w:pPr>
       <w:keepNext/>
     </w:pPr>
   </w:style>
-  <w:style w:customStyle="1" w:styleId="ImageCaption" w:type="paragraph">
+  <w:style w:type="paragraph" w:customStyle="1" w:styleId="ImageCaption">
     <w:name w:val="Image Caption"/>
     <w:basedOn w:val="Caption"/>
   </w:style>
-  <w:style w:customStyle="1" w:styleId="Figure" w:type="paragraph">
+  <w:style w:type="paragraph" w:customStyle="1" w:styleId="Figure">
     <w:name w:val="Figure"/>
     <w:basedOn w:val="Normal"/>
   </w:style>
-  <w:style w:customStyle="1" w:styleId="CaptionedFigure" w:type="paragraph">
+  <w:style w:type="paragraph" w:customStyle="1" w:styleId="CaptionedFigure">
     <w:name w:val="Captioned Figure"/>
     <w:basedOn w:val="Figure"/>
     <w:pPr>
       <w:keepNext/>
     </w:pPr>
   </w:style>
-  <w:style w:customStyle="1" w:styleId="BodyTextChar" w:type="character">
+  <w:style w:type="character" w:customStyle="1" w:styleId="BodyTextChar">
     <w:name w:val="Body Text Char"/>
     <w:basedOn w:val="DefaultParagraphFont"/>
     <w:link w:val="BodyText"/>
   </w:style>
-  <w:style w:customStyle="1" w:styleId="VerbatimChar" w:type="character">
+  <w:style w:type="character" w:customStyle="1" w:styleId="VerbatimChar">
     <w:name w:val="Verbatim Char"/>
     <w:basedOn w:val="BodyTextChar"/>
     <w:rPr>
@@ -1521,25 +1528,21 @@
       <w:sz w:val="22"/>
     </w:rPr>
   </w:style>
-  <w:style w:customStyle="1" w:styleId="SectionNumber" w:type="character">
-    <w:name w:val="Section Number"/>
-    <w:basedOn w:val="BodyTextChar"/>
-  </w:style>
-  <w:style w:styleId="FootnoteReference" w:type="character">
+  <w:style w:type="character" w:styleId="FootnoteReference">
     <w:name w:val="Footnote Reference"/>
     <w:basedOn w:val="BodyTextChar"/>
     <w:rPr>
       <w:vertAlign w:val="superscript"/>
     </w:rPr>
   </w:style>
-  <w:style w:styleId="Hyperlink" w:type="character">
+  <w:style w:type="character" w:styleId="Hyperlink">
     <w:name w:val="Hyperlink"/>
     <w:basedOn w:val="BodyTextChar"/>
     <w:rPr>
-      <w:color w:themeColor="accent1" w:val="4F81BD"/>
-    </w:rPr>
-  </w:style>
-  <w:style w:styleId="TOCHeading" w:type="paragraph">
+      <w:color w:val="4F81BD" w:themeColor="accent1"/>
+    </w:rPr>
+  </w:style>
+  <w:style w:type="paragraph" w:styleId="TOCHeading">
     <w:name w:val="TOC Heading"/>
     <w:basedOn w:val="Heading1"/>
     <w:next w:val="BodyText"/>
@@ -1551,10 +1554,10 @@
       <w:outlineLvl w:val="9"/>
     </w:pPr>
     <w:rPr>
-      <w:rFonts w:asciiTheme="majorHAnsi" w:cstheme="majorBidi" w:eastAsiaTheme="majorEastAsia" w:hAnsiTheme="majorHAnsi"/>
+      <w:rFonts w:asciiTheme="majorHAnsi" w:eastAsiaTheme="majorEastAsia" w:hAnsiTheme="majorHAnsi" w:cstheme="majorBidi"/>
       <w:b w:val="0"/>
       <w:bCs w:val="0"/>
-      <w:color w:themeColor="accent1" w:themeShade="BF" w:val="365F91"/>
+      <w:color w:val="365F91" w:themeColor="accent1" w:themeShade="BF"/>
     </w:rPr>
   </w:style>
   <w:style w:type="paragraph" w:customStyle="1" w:styleId="SourceCode">
@@ -1646,10 +1649,7 @@
   <w:style w:type="character" w:customStyle="1" w:styleId="ImportTok">
     <w:name w:val="ImportTok"/>
     <w:basedOn w:val="VerbatimChar"/>
-    <w:rPr>
-      <w:color w:val="008000"/>
-      <w:b/>
-    </w:rPr>
+    <w:rPr/>
   </w:style>
   <w:style w:type="character" w:customStyle="1" w:styleId="CommentTok">
     <w:name w:val="CommentTok"/>
@@ -1724,9 +1724,7 @@
   <w:style w:type="character" w:customStyle="1" w:styleId="BuiltInTok">
     <w:name w:val="BuiltInTok"/>
     <w:basedOn w:val="VerbatimChar"/>
-    <w:rPr>
-      <w:color w:val="008000"/>
-    </w:rPr>
+    <w:rPr/>
   </w:style>
   <w:style w:type="character" w:customStyle="1" w:styleId="ExtensionTok">
     <w:name w:val="ExtensionTok"/>

</xml_diff>